<commit_message>
letters: the list number and date now sit exactly where the single letter puts them
</commit_message>
<xml_diff>
--- a/backend/documents/letter_templates/process_list.docx
+++ b/backend/documents/letter_templates/process_list.docx
@@ -4230,23 +4230,6 @@
 
 <file path=word/header1.xml><?xml version="1.0" encoding="utf-8"?>
 <w:hdr xmlns:a="http://schemas.openxmlformats.org/drawingml/2006/main" xmlns:mc="http://schemas.openxmlformats.org/markup-compatibility/2006" xmlns:pic="http://schemas.openxmlformats.org/drawingml/2006/picture" xmlns:r="http://schemas.openxmlformats.org/officeDocument/2006/relationships" xmlns:w="http://schemas.openxmlformats.org/wordprocessingml/2006/main" xmlns:w14="http://schemas.microsoft.com/office/word/2010/wordml" xmlns:wp="http://schemas.openxmlformats.org/drawingml/2006/wordprocessingDrawing" xmlns:wps="http://schemas.microsoft.com/office/word/2010/wordprocessingShape">
-  <w:p>
-    <w:pPr>
-      <w:tabs>
-        <w:tab w:val="right" w:leader="none" w:pos="2520"/>
-      </w:tabs>
-      <w:bidi w:val="1"/>
-      <w:rPr>
-        <w:sz w:val="30"/>
-        <w:szCs w:val="30"/>
-      </w:rPr>
-    </w:pPr>
-    <w:r>
-      <w:rPr>
-        <w:rtl w:val="0"/>
-      </w:rPr>
-    </w:r>
-  </w:p>
   <w:p>
     <w:pPr>
       <w:rPr/>
@@ -5281,6 +5264,7 @@
       </w:rPr>
     </w:r>
   </w:p>
+  <w:p/>
   <w:p>
     <w:pPr>
       <w:widowControl w:val="0"/>

</xml_diff>